<commit_message>
Fix Assessment 5 video slide timing
</commit_message>
<xml_diff>
--- a/unit-4/assessment-5-deep-learning-training-project/Unit 4 Assessment 5 - SS Evidence Collection - Rob Johnston.docx
+++ b/unit-4/assessment-5-deep-learning-training-project/Unit 4 Assessment 5 - SS Evidence Collection - Rob Johnston.docx
@@ -1003,7 +1003,7 @@
               <w:drawing>
                 <wp:inline xmlns:a="http://schemas.openxmlformats.org/drawingml/2006/main" xmlns:pic="http://schemas.openxmlformats.org/drawingml/2006/picture">
                   <wp:extent cx="2788920" cy="1568768"/>
-                  <wp:docPr id="48" name="Picture 48"/>
+                  <wp:docPr id="47" name="Picture 47"/>
                   <wp:cNvGraphicFramePr>
                     <a:graphicFrameLocks noChangeAspect="1"/>
                   </wp:cNvGraphicFramePr>
@@ -1015,7 +1015,7 @@
                           <pic:cNvPicPr/>
                         </pic:nvPicPr>
                         <pic:blipFill>
-                          <a:blip r:embed="rId23"/>
+                          <a:blip r:embed="rId25"/>
                           <a:stretch>
                             <a:fillRect/>
                           </a:stretch>

</xml_diff>